<commit_message>
Documento di architettura: come si avvia l'applicazione
Il capitolo 10 elencava i comandi ma non diceva come si avvia il
programma. Aggiunti:

- 10.2 avvio: eseguibile pubblicato e dotnet run, configurazione via
  appsettings e variabili PURGE_ con il doppio underscore, e il fatto che
  la modalita' non e' configurabile (nessuna PURGE_DRY_RUN)
- 10.3 le due modalita': esecuzione singola per lo scheduler esterno e
  servizio con pianificazione interna, dry-run per costruzione; perche' la
  finestra vale in entrambe
- 10.4 comandi: nove forme complete, nomi delle strategie ammessi,
  posizione dell'argomento, --no-window, comportamento del lock di istanza
- 10.5 tre sessioni copiabili: prima installazione, dalla simulazione alla
  prima cancellazione, ripresa di un run interrotto
- 10.6 codici di uscita spostati in coda al capitolo, con 5 e 130 marcati
  come esiti non di guasto
</commit_message>
<xml_diff>
--- a/docs/architettura/Architecture-Functional-Design-Sfoltimento-2026-09-09.docx
+++ b/docs/architettura/Architecture-Functional-Design-Sfoltimento-2026-09-09.docx
@@ -8200,7 +8200,333 @@
           <w:sz w:val="24"/>
           <w:szCs w:val="24"/>
         </w:rPr>
-        <w:t xml:space="preserve">10.2 I comandi</w:t>
+        <w:t xml:space="preserve">10.2 Come si avvia l'applicazione</w:t>
+      </w:r>
+    </w:p>
+    <w:p>
+      <w:pPr>
+        <w:spacing w:after="140" w:line="276"/>
+      </w:pPr>
+      <w:r>
+        <w:rPr>
+          <w:sz w:val="21"/>
+          <w:szCs w:val="21"/>
+        </w:rPr>
+        <w:t xml:space="preserve">Il motore è un eseguibile a riga di comando. In produzione si usa la versione pubblicata; in sviluppo si può lanciare dal repository.</w:t>
+      </w:r>
+    </w:p>
+    <w:p>
+      <w:pPr>
+        <w:shd w:fill="F2F4F7" w:val="clear"/>
+        <w:spacing w:after="0" w:line="240"/>
+        <w:ind w:left="360"/>
+      </w:pPr>
+      <w:r>
+        <w:rPr>
+          <w:rFonts w:ascii="Consolas" w:cs="Consolas" w:eastAsia="Consolas" w:hAnsi="Consolas"/>
+          <w:color w:val="20304A"/>
+          <w:sz w:val="18"/>
+          <w:szCs w:val="18"/>
+        </w:rPr>
+        <w:t xml:space="preserve"># produzione (artefatto pubblicato)</w:t>
+      </w:r>
+    </w:p>
+    <w:p>
+      <w:pPr>
+        <w:shd w:fill="F2F4F7" w:val="clear"/>
+        <w:spacing w:after="0" w:line="240"/>
+        <w:ind w:left="360"/>
+      </w:pPr>
+      <w:r>
+        <w:rPr>
+          <w:rFonts w:ascii="Consolas" w:cs="Consolas" w:eastAsia="Consolas" w:hAnsi="Consolas"/>
+          <w:color w:val="20304A"/>
+          <w:sz w:val="18"/>
+          <w:szCs w:val="18"/>
+        </w:rPr>
+        <w:t xml:space="preserve">dotnet publish -c Release src/OSM.PaymentOrder.Purge.Host -o /opt/purge</w:t>
+      </w:r>
+    </w:p>
+    <w:p>
+      <w:pPr>
+        <w:shd w:fill="F2F4F7" w:val="clear"/>
+        <w:spacing w:after="0" w:line="240"/>
+        <w:ind w:left="360"/>
+      </w:pPr>
+      <w:r>
+        <w:rPr>
+          <w:rFonts w:ascii="Consolas" w:cs="Consolas" w:eastAsia="Consolas" w:hAnsi="Consolas"/>
+          <w:color w:val="20304A"/>
+          <w:sz w:val="18"/>
+          <w:szCs w:val="18"/>
+        </w:rPr>
+        <w:t xml:space="preserve">/opt/purge/OSM.PaymentOrder.Purge.Host once --dry-run</w:t>
+      </w:r>
+    </w:p>
+    <w:p>
+      <w:pPr>
+        <w:shd w:fill="F2F4F7" w:val="clear"/>
+        <w:spacing w:after="0" w:line="240"/>
+        <w:ind w:left="360"/>
+      </w:pPr>
+      <w:r>
+        <w:rPr>
+          <w:rFonts w:ascii="Consolas" w:cs="Consolas" w:eastAsia="Consolas" w:hAnsi="Consolas"/>
+          <w:color w:val="20304A"/>
+          <w:sz w:val="18"/>
+          <w:szCs w:val="18"/>
+        </w:rPr>
+        <w:t xml:space="preserve"> </w:t>
+      </w:r>
+    </w:p>
+    <w:p>
+      <w:pPr>
+        <w:shd w:fill="F2F4F7" w:val="clear"/>
+        <w:spacing w:after="0" w:line="240"/>
+        <w:ind w:left="360"/>
+      </w:pPr>
+      <w:r>
+        <w:rPr>
+          <w:rFonts w:ascii="Consolas" w:cs="Consolas" w:eastAsia="Consolas" w:hAnsi="Consolas"/>
+          <w:color w:val="20304A"/>
+          <w:sz w:val="18"/>
+          <w:szCs w:val="18"/>
+        </w:rPr>
+        <w:t xml:space="preserve"># sviluppo (dal repository)</w:t>
+      </w:r>
+    </w:p>
+    <w:p>
+      <w:pPr>
+        <w:shd w:fill="F2F4F7" w:val="clear"/>
+        <w:spacing w:after="160" w:line="240"/>
+        <w:ind w:left="360"/>
+      </w:pPr>
+      <w:r>
+        <w:rPr>
+          <w:rFonts w:ascii="Consolas" w:cs="Consolas" w:eastAsia="Consolas" w:hAnsi="Consolas"/>
+          <w:color w:val="20304A"/>
+          <w:sz w:val="18"/>
+          <w:szCs w:val="18"/>
+        </w:rPr>
+        <w:t xml:space="preserve">dotnet run --project src/OSM.PaymentOrder.Purge.Host -- once --dry-run</w:t>
+      </w:r>
+    </w:p>
+    <w:p>
+      <w:pPr>
+        <w:spacing w:after="140" w:line="276"/>
+      </w:pPr>
+      <w:r>
+        <w:rPr>
+          <w:sz w:val="21"/>
+          <w:szCs w:val="21"/>
+        </w:rPr>
+        <w:t xml:space="preserve">Negli esempi che seguono </w:t>
+      </w:r>
+      <w:r>
+        <w:rPr>
+          <w:rFonts w:ascii="Consolas" w:cs="Consolas" w:eastAsia="Consolas" w:hAnsi="Consolas"/>
+          <w:color w:val="20304A"/>
+          <w:sz w:val="21"/>
+          <w:szCs w:val="21"/>
+        </w:rPr>
+        <w:t xml:space="preserve">purge</w:t>
+      </w:r>
+      <w:r>
+        <w:rPr>
+          <w:sz w:val="21"/>
+          <w:szCs w:val="21"/>
+        </w:rPr>
+        <w:t xml:space="preserve"> sta per l'eseguibile pubblicato, o per </w:t>
+      </w:r>
+      <w:r>
+        <w:rPr>
+          <w:rFonts w:ascii="Consolas" w:cs="Consolas" w:eastAsia="Consolas" w:hAnsi="Consolas"/>
+          <w:color w:val="20304A"/>
+          <w:sz w:val="21"/>
+          <w:szCs w:val="21"/>
+        </w:rPr>
+        <w:t xml:space="preserve">dotnet run --project ... --</w:t>
+      </w:r>
+      <w:r>
+        <w:rPr>
+          <w:sz w:val="21"/>
+          <w:szCs w:val="21"/>
+        </w:rPr>
+        <w:t xml:space="preserve">: tutto ciò che segue è identico nei due casi.</w:t>
+      </w:r>
+    </w:p>
+    <w:p>
+      <w:pPr>
+        <w:pBdr>
+          <w:left w:val="single" w:color="8FA3C0" w:sz="18" w:space="12"/>
+        </w:pBdr>
+        <w:spacing w:after="180" w:before="60" w:line="276"/>
+        <w:ind w:left="360"/>
+      </w:pPr>
+      <w:r>
+        <w:rPr>
+          <w:color w:val="44506B"/>
+          <w:sz w:val="20"/>
+          <w:szCs w:val="20"/>
+        </w:rPr>
+        <w:t xml:space="preserve">Il processo legge appsettings.json dalla cartella dell'eseguibile, non dalla cartella corrente. Un lancio da un'altra directory funziona; un eseguibile copiato altrove senza il suo appsettings no.</w:t>
+      </w:r>
+    </w:p>
+    <w:p>
+      <w:pPr>
+        <w:pStyle w:val="Heading3"/>
+        <w:spacing w:after="100" w:before="200"/>
+      </w:pPr>
+      <w:r>
+        <w:rPr>
+          <w:b/>
+          <w:bCs/>
+          <w:color w:val="2E4570"/>
+          <w:sz w:val="22"/>
+          <w:szCs w:val="22"/>
+        </w:rPr>
+        <w:t xml:space="preserve">Configurazione</w:t>
+      </w:r>
+    </w:p>
+    <w:p>
+      <w:pPr>
+        <w:spacing w:after="140" w:line="276"/>
+      </w:pPr>
+      <w:r>
+        <w:rPr>
+          <w:sz w:val="21"/>
+          <w:szCs w:val="21"/>
+        </w:rPr>
+        <w:t xml:space="preserve">I parametri arrivano da tre fonti, in ordine di precedenza crescente: appsettings.json accanto all'eseguibile, appsettings.&lt;Ambiente&gt;.json, variabili d'ambiente. In produzione la stringa di connessione va nelle variabili, non nel file.</w:t>
+      </w:r>
+    </w:p>
+    <w:p>
+      <w:pPr>
+        <w:spacing w:after="140" w:line="276"/>
+      </w:pPr>
+      <w:r>
+        <w:rPr>
+          <w:sz w:val="21"/>
+          <w:szCs w:val="21"/>
+        </w:rPr>
+        <w:t xml:space="preserve">Le variabili usano il prefisso PURGE_ e il doppio underscore come separatore di livello:</w:t>
+      </w:r>
+    </w:p>
+    <w:p>
+      <w:pPr>
+        <w:shd w:fill="F2F4F7" w:val="clear"/>
+        <w:spacing w:after="0" w:line="240"/>
+        <w:ind w:left="360"/>
+      </w:pPr>
+      <w:r>
+        <w:rPr>
+          <w:rFonts w:ascii="Consolas" w:cs="Consolas" w:eastAsia="Consolas" w:hAnsi="Consolas"/>
+          <w:color w:val="20304A"/>
+          <w:sz w:val="18"/>
+          <w:szCs w:val="18"/>
+        </w:rPr>
+        <w:t xml:space="preserve">PURGE_ConnectionStrings__PaymentOrder=Server=host,1433;Database=...;User Id=...;Password=...;Encrypt=true</w:t>
+      </w:r>
+    </w:p>
+    <w:p>
+      <w:pPr>
+        <w:shd w:fill="F2F4F7" w:val="clear"/>
+        <w:spacing w:after="0" w:line="240"/>
+        <w:ind w:left="360"/>
+      </w:pPr>
+      <w:r>
+        <w:rPr>
+          <w:rFonts w:ascii="Consolas" w:cs="Consolas" w:eastAsia="Consolas" w:hAnsi="Consolas"/>
+          <w:color w:val="20304A"/>
+          <w:sz w:val="18"/>
+          <w:szCs w:val="18"/>
+        </w:rPr>
+        <w:t xml:space="preserve">PURGE_Purge__RetentionYears=5</w:t>
+      </w:r>
+    </w:p>
+    <w:p>
+      <w:pPr>
+        <w:shd w:fill="F2F4F7" w:val="clear"/>
+        <w:spacing w:after="0" w:line="240"/>
+        <w:ind w:left="360"/>
+      </w:pPr>
+      <w:r>
+        <w:rPr>
+          <w:rFonts w:ascii="Consolas" w:cs="Consolas" w:eastAsia="Consolas" w:hAnsi="Consolas"/>
+          <w:color w:val="20304A"/>
+          <w:sz w:val="18"/>
+          <w:szCs w:val="18"/>
+        </w:rPr>
+        <w:t xml:space="preserve">PURGE_Purge__AnchorMode=FiscalYearEnd</w:t>
+      </w:r>
+    </w:p>
+    <w:p>
+      <w:pPr>
+        <w:shd w:fill="F2F4F7" w:val="clear"/>
+        <w:spacing w:after="0" w:line="240"/>
+        <w:ind w:left="360"/>
+      </w:pPr>
+      <w:r>
+        <w:rPr>
+          <w:rFonts w:ascii="Consolas" w:cs="Consolas" w:eastAsia="Consolas" w:hAnsi="Consolas"/>
+          <w:color w:val="20304A"/>
+          <w:sz w:val="18"/>
+          <w:szCs w:val="18"/>
+        </w:rPr>
+        <w:t xml:space="preserve">PURGE_Purge__WindowStart=01:00</w:t>
+      </w:r>
+    </w:p>
+    <w:p>
+      <w:pPr>
+        <w:shd w:fill="F2F4F7" w:val="clear"/>
+        <w:spacing w:after="160" w:line="240"/>
+        <w:ind w:left="360"/>
+      </w:pPr>
+      <w:r>
+        <w:rPr>
+          <w:rFonts w:ascii="Consolas" w:cs="Consolas" w:eastAsia="Consolas" w:hAnsi="Consolas"/>
+          <w:color w:val="20304A"/>
+          <w:sz w:val="18"/>
+          <w:szCs w:val="18"/>
+        </w:rPr>
+        <w:t xml:space="preserve">PURGE_Purge__WindowEnd=05:00</w:t>
+      </w:r>
+    </w:p>
+    <w:p>
+      <w:pPr>
+        <w:spacing w:after="140" w:line="276"/>
+      </w:pPr>
+      <w:r>
+        <w:rPr>
+          <w:b w:val="1"/>
+          <w:bCs w:val="1"/>
+          <w:sz w:val="21"/>
+          <w:szCs w:val="21"/>
+        </w:rPr>
+        <w:t xml:space="preserve">La modalità non è configurabile. </w:t>
+      </w:r>
+      <w:r>
+        <w:rPr>
+          <w:sz w:val="21"/>
+          <w:szCs w:val="21"/>
+        </w:rPr>
+        <w:t xml:space="preserve">Non esistono variabili PURGE_DRY_RUN o PURGE_DELETE: la scelta fra simulazione e cancellazione è una proprietà del comando, non dell'ambiente in cui gira (§9.1, livello 2). Senza modalità il comando non esegue nulla ed esce con codice 2.</w:t>
+      </w:r>
+    </w:p>
+    <w:p>
+      <w:pPr>
+        <w:pStyle w:val="Heading2"/>
+        <w:spacing w:after="120" w:before="260"/>
+      </w:pPr>
+      <w:r>
+        <w:rPr>
+          <w:b/>
+          <w:bCs/>
+          <w:color w:val="1F3864"/>
+          <w:sz w:val="24"/>
+          <w:szCs w:val="24"/>
+        </w:rPr>
+        <w:t xml:space="preserve">10.3 Le due modalità di esecuzione</w:t>
       </w:r>
     </w:p>
     <w:p>
@@ -8221,8 +8547,9 @@
         </w:tblBorders>
       </w:tblPr>
       <w:tblGrid>
-        <w:gridCol w:w="3600"/>
-        <w:gridCol w:w="5800"/>
+        <w:gridCol w:w="2100"/>
+        <w:gridCol w:w="2500"/>
+        <w:gridCol w:w="4800"/>
       </w:tblGrid>
       <w:tr>
         <w:trPr>
@@ -8230,7 +8557,7 @@
         </w:trPr>
         <w:tc>
           <w:tcPr>
-            <w:tcW w:type="dxa" w:w="3600"/>
+            <w:tcW w:type="dxa" w:w="2100"/>
             <w:shd w:fill="E7ECF3" w:val="clear"/>
             <w:tcMar>
               <w:top w:type="dxa" w:w="70"/>
@@ -8250,13 +8577,13 @@
                 <w:sz w:val="19"/>
                 <w:szCs w:val="19"/>
               </w:rPr>
-              <w:t xml:space="preserve">Comando</w:t>
-            </w:r>
-          </w:p>
-        </w:tc>
-        <w:tc>
-          <w:tcPr>
-            <w:tcW w:type="dxa" w:w="5800"/>
+              <w:t xml:space="preserve">Modalità</w:t>
+            </w:r>
+          </w:p>
+        </w:tc>
+        <w:tc>
+          <w:tcPr>
+            <w:tcW w:type="dxa" w:w="2500"/>
             <w:shd w:fill="E7ECF3" w:val="clear"/>
             <w:tcMar>
               <w:top w:type="dxa" w:w="70"/>
@@ -8276,7 +8603,33 @@
                 <w:sz w:val="19"/>
                 <w:szCs w:val="19"/>
               </w:rPr>
-              <w:t xml:space="preserve">Effetto</w:t>
+              <w:t xml:space="preserve">Come si avvia</w:t>
+            </w:r>
+          </w:p>
+        </w:tc>
+        <w:tc>
+          <w:tcPr>
+            <w:tcW w:type="dxa" w:w="4800"/>
+            <w:shd w:fill="E7ECF3" w:val="clear"/>
+            <w:tcMar>
+              <w:top w:type="dxa" w:w="70"/>
+              <w:left w:type="dxa" w:w="110"/>
+              <w:bottom w:type="dxa" w:w="70"/>
+              <w:right w:type="dxa" w:w="110"/>
+            </w:tcMar>
+          </w:tcPr>
+          <w:p>
+            <w:pPr>
+              <w:spacing w:after="0" w:line="250"/>
+            </w:pPr>
+            <w:r>
+              <w:rPr>
+                <w:b/>
+                <w:bCs/>
+                <w:sz w:val="19"/>
+                <w:szCs w:val="19"/>
+              </w:rPr>
+              <w:t xml:space="preserve">Comportamento</w:t>
             </w:r>
           </w:p>
         </w:tc>
@@ -8284,52 +8637,76 @@
       <w:tr>
         <w:tc>
           <w:tcPr>
-            <w:tcW w:type="dxa" w:w="3600"/>
-            <w:tcMar>
-              <w:top w:type="dxa" w:w="70"/>
-              <w:left w:type="dxa" w:w="110"/>
-              <w:bottom w:type="dxa" w:w="70"/>
-              <w:right w:type="dxa" w:w="110"/>
-            </w:tcMar>
-          </w:tcPr>
-          <w:p>
-            <w:pPr>
-              <w:spacing w:after="0" w:line="250"/>
-            </w:pPr>
-            <w:r>
-              <w:rPr>
-                <w:rFonts w:ascii="Consolas" w:cs="Consolas" w:eastAsia="Consolas" w:hAnsi="Consolas"/>
-                <w:b w:val="false"/>
-                <w:bCs w:val="false"/>
-                <w:sz w:val="17"/>
-                <w:szCs w:val="17"/>
-              </w:rPr>
-              <w:t xml:space="preserve">purge migrate [--status]</w:t>
-            </w:r>
-          </w:p>
-        </w:tc>
-        <w:tc>
-          <w:tcPr>
-            <w:tcW w:type="dxa" w:w="5800"/>
-            <w:tcMar>
-              <w:top w:type="dxa" w:w="70"/>
-              <w:left w:type="dxa" w:w="110"/>
-              <w:bottom w:type="dxa" w:w="70"/>
-              <w:right w:type="dxa" w:w="110"/>
-            </w:tcMar>
-          </w:tcPr>
-          <w:p>
-            <w:pPr>
-              <w:spacing w:after="0" w:line="250"/>
-            </w:pPr>
-            <w:r>
-              <w:rPr>
-                <w:b w:val="false"/>
-                <w:bCs w:val="false"/>
-                <w:sz w:val="19"/>
-                <w:szCs w:val="19"/>
-              </w:rPr>
-              <w:t xml:space="preserve">Allinea lo schema Purge, o ne riporta lo stato</w:t>
+            <w:tcW w:type="dxa" w:w="2100"/>
+            <w:tcMar>
+              <w:top w:type="dxa" w:w="70"/>
+              <w:left w:type="dxa" w:w="110"/>
+              <w:bottom w:type="dxa" w:w="70"/>
+              <w:right w:type="dxa" w:w="110"/>
+            </w:tcMar>
+          </w:tcPr>
+          <w:p>
+            <w:pPr>
+              <w:spacing w:after="0" w:line="250"/>
+            </w:pPr>
+            <w:r>
+              <w:rPr>
+                <w:b w:val="false"/>
+                <w:bCs w:val="false"/>
+                <w:sz w:val="19"/>
+                <w:szCs w:val="19"/>
+              </w:rPr>
+              <w:t xml:space="preserve">Esecuzione singola</w:t>
+            </w:r>
+          </w:p>
+        </w:tc>
+        <w:tc>
+          <w:tcPr>
+            <w:tcW w:type="dxa" w:w="2500"/>
+            <w:tcMar>
+              <w:top w:type="dxa" w:w="70"/>
+              <w:left w:type="dxa" w:w="110"/>
+              <w:bottom w:type="dxa" w:w="70"/>
+              <w:right w:type="dxa" w:w="110"/>
+            </w:tcMar>
+          </w:tcPr>
+          <w:p>
+            <w:pPr>
+              <w:spacing w:after="0" w:line="250"/>
+            </w:pPr>
+            <w:r>
+              <w:rPr>
+                <w:b w:val="false"/>
+                <w:bCs w:val="false"/>
+                <w:sz w:val="19"/>
+                <w:szCs w:val="19"/>
+              </w:rPr>
+              <w:t xml:space="preserve">purge once …</w:t>
+            </w:r>
+          </w:p>
+        </w:tc>
+        <w:tc>
+          <w:tcPr>
+            <w:tcW w:type="dxa" w:w="4800"/>
+            <w:tcMar>
+              <w:top w:type="dxa" w:w="70"/>
+              <w:left w:type="dxa" w:w="110"/>
+              <w:bottom w:type="dxa" w:w="70"/>
+              <w:right w:type="dxa" w:w="110"/>
+            </w:tcMar>
+          </w:tcPr>
+          <w:p>
+            <w:pPr>
+              <w:spacing w:after="0" w:line="250"/>
+            </w:pPr>
+            <w:r>
+              <w:rPr>
+                <w:b w:val="false"/>
+                <w:bCs w:val="false"/>
+                <w:sz w:val="19"/>
+                <w:szCs w:val="19"/>
+              </w:rPr>
+              <w:t xml:space="preserve">Esegue una volta e termina, restituendo un codice di uscita. È la modalità pensata per uno scheduler esterno (UC4, cron, Task Scheduler), che decide quando eseguire e raccoglie l'esito.</w:t>
             </w:r>
           </w:p>
         </w:tc>
@@ -8337,220 +8714,101 @@
       <w:tr>
         <w:tc>
           <w:tcPr>
-            <w:tcW w:type="dxa" w:w="3600"/>
-            <w:shd w:fill="F5F7FA" w:val="clear"/>
-            <w:tcMar>
-              <w:top w:type="dxa" w:w="70"/>
-              <w:left w:type="dxa" w:w="110"/>
-              <w:bottom w:type="dxa" w:w="70"/>
-              <w:right w:type="dxa" w:w="110"/>
-            </w:tcMar>
-          </w:tcPr>
-          <w:p>
-            <w:pPr>
-              <w:spacing w:after="0" w:line="250"/>
-            </w:pPr>
-            <w:r>
-              <w:rPr>
-                <w:rFonts w:ascii="Consolas" w:cs="Consolas" w:eastAsia="Consolas" w:hAnsi="Consolas"/>
-                <w:b w:val="false"/>
-                <w:bCs w:val="false"/>
-                <w:sz w:val="17"/>
-                <w:szCs w:val="17"/>
-              </w:rPr>
-              <w:t xml:space="preserve">purge once --dry-run [Strategia]</w:t>
-            </w:r>
-          </w:p>
-        </w:tc>
-        <w:tc>
-          <w:tcPr>
-            <w:tcW w:type="dxa" w:w="5800"/>
-            <w:shd w:fill="F5F7FA" w:val="clear"/>
-            <w:tcMar>
-              <w:top w:type="dxa" w:w="70"/>
-              <w:left w:type="dxa" w:w="110"/>
-              <w:bottom w:type="dxa" w:w="70"/>
-              <w:right w:type="dxa" w:w="110"/>
-            </w:tcMar>
-          </w:tcPr>
-          <w:p>
-            <w:pPr>
-              <w:spacing w:after="0" w:line="250"/>
-            </w:pPr>
-            <w:r>
-              <w:rPr>
-                <w:b w:val="false"/>
-                <w:bCs w:val="false"/>
-                <w:sz w:val="19"/>
-                <w:szCs w:val="19"/>
-              </w:rPr>
-              <w:t xml:space="preserve">Simula: nessuna cancellazione, produce il report</w:t>
-            </w:r>
-          </w:p>
-        </w:tc>
-      </w:tr>
-      <w:tr>
-        <w:tc>
-          <w:tcPr>
-            <w:tcW w:type="dxa" w:w="3600"/>
-            <w:tcMar>
-              <w:top w:type="dxa" w:w="70"/>
-              <w:left w:type="dxa" w:w="110"/>
-              <w:bottom w:type="dxa" w:w="70"/>
-              <w:right w:type="dxa" w:w="110"/>
-            </w:tcMar>
-          </w:tcPr>
-          <w:p>
-            <w:pPr>
-              <w:spacing w:after="0" w:line="250"/>
-            </w:pPr>
-            <w:r>
-              <w:rPr>
-                <w:rFonts w:ascii="Consolas" w:cs="Consolas" w:eastAsia="Consolas" w:hAnsi="Consolas"/>
-                <w:b w:val="false"/>
-                <w:bCs w:val="false"/>
-                <w:sz w:val="17"/>
-                <w:szCs w:val="17"/>
-              </w:rPr>
-              <w:t xml:space="preserve">purge approve &lt;run-id&gt; --by "&lt;nome&gt;"</w:t>
-            </w:r>
-          </w:p>
-        </w:tc>
-        <w:tc>
-          <w:tcPr>
-            <w:tcW w:type="dxa" w:w="5800"/>
-            <w:tcMar>
-              <w:top w:type="dxa" w:w="70"/>
-              <w:left w:type="dxa" w:w="110"/>
-              <w:bottom w:type="dxa" w:w="70"/>
-              <w:right w:type="dxa" w:w="110"/>
-            </w:tcMar>
-          </w:tcPr>
-          <w:p>
-            <w:pPr>
-              <w:spacing w:after="0" w:line="250"/>
-            </w:pPr>
-            <w:r>
-              <w:rPr>
-                <w:b w:val="false"/>
-                <w:bCs w:val="false"/>
-                <w:sz w:val="19"/>
-                <w:szCs w:val="19"/>
-              </w:rPr>
-              <w:t xml:space="preserve">Registra l'approvazione della policy</w:t>
-            </w:r>
-          </w:p>
-        </w:tc>
-      </w:tr>
-      <w:tr>
-        <w:tc>
-          <w:tcPr>
-            <w:tcW w:type="dxa" w:w="3600"/>
-            <w:shd w:fill="F5F7FA" w:val="clear"/>
-            <w:tcMar>
-              <w:top w:type="dxa" w:w="70"/>
-              <w:left w:type="dxa" w:w="110"/>
-              <w:bottom w:type="dxa" w:w="70"/>
-              <w:right w:type="dxa" w:w="110"/>
-            </w:tcMar>
-          </w:tcPr>
-          <w:p>
-            <w:pPr>
-              <w:spacing w:after="0" w:line="250"/>
-            </w:pPr>
-            <w:r>
-              <w:rPr>
-                <w:rFonts w:ascii="Consolas" w:cs="Consolas" w:eastAsia="Consolas" w:hAnsi="Consolas"/>
-                <w:b w:val="false"/>
-                <w:bCs w:val="false"/>
-                <w:sz w:val="17"/>
-                <w:szCs w:val="17"/>
-              </w:rPr>
-              <w:t xml:space="preserve">purge once --delete [Strategia]</w:t>
-            </w:r>
-          </w:p>
-        </w:tc>
-        <w:tc>
-          <w:tcPr>
-            <w:tcW w:type="dxa" w:w="5800"/>
-            <w:shd w:fill="F5F7FA" w:val="clear"/>
-            <w:tcMar>
-              <w:top w:type="dxa" w:w="70"/>
-              <w:left w:type="dxa" w:w="110"/>
-              <w:bottom w:type="dxa" w:w="70"/>
-              <w:right w:type="dxa" w:w="110"/>
-            </w:tcMar>
-          </w:tcPr>
-          <w:p>
-            <w:pPr>
-              <w:spacing w:after="0" w:line="250"/>
-            </w:pPr>
-            <w:r>
-              <w:rPr>
-                <w:b w:val="false"/>
-                <w:bCs w:val="false"/>
-                <w:sz w:val="19"/>
-                <w:szCs w:val="19"/>
-              </w:rPr>
-              <w:t xml:space="preserve">Esecuzione reale</w:t>
-            </w:r>
-          </w:p>
-        </w:tc>
-      </w:tr>
-      <w:tr>
-        <w:tc>
-          <w:tcPr>
-            <w:tcW w:type="dxa" w:w="3600"/>
-            <w:tcMar>
-              <w:top w:type="dxa" w:w="70"/>
-              <w:left w:type="dxa" w:w="110"/>
-              <w:bottom w:type="dxa" w:w="70"/>
-              <w:right w:type="dxa" w:w="110"/>
-            </w:tcMar>
-          </w:tcPr>
-          <w:p>
-            <w:pPr>
-              <w:spacing w:after="0" w:line="250"/>
-            </w:pPr>
-            <w:r>
-              <w:rPr>
-                <w:rFonts w:ascii="Consolas" w:cs="Consolas" w:eastAsia="Consolas" w:hAnsi="Consolas"/>
-                <w:b w:val="false"/>
-                <w:bCs w:val="false"/>
-                <w:sz w:val="17"/>
-                <w:szCs w:val="17"/>
-              </w:rPr>
-              <w:t xml:space="preserve">purge</w:t>
-            </w:r>
-          </w:p>
-        </w:tc>
-        <w:tc>
-          <w:tcPr>
-            <w:tcW w:type="dxa" w:w="5800"/>
-            <w:tcMar>
-              <w:top w:type="dxa" w:w="70"/>
-              <w:left w:type="dxa" w:w="110"/>
-              <w:bottom w:type="dxa" w:w="70"/>
-              <w:right w:type="dxa" w:w="110"/>
-            </w:tcMar>
-          </w:tcPr>
-          <w:p>
-            <w:pPr>
-              <w:spacing w:after="0" w:line="250"/>
-            </w:pPr>
-            <w:r>
-              <w:rPr>
-                <w:b w:val="false"/>
-                <w:bCs w:val="false"/>
-                <w:sz w:val="19"/>
-                <w:szCs w:val="19"/>
-              </w:rPr>
-              <w:t xml:space="preserve">Servizio con pianificazione interna</w:t>
+            <w:tcW w:type="dxa" w:w="2100"/>
+            <w:shd w:fill="F5F7FA" w:val="clear"/>
+            <w:tcMar>
+              <w:top w:type="dxa" w:w="70"/>
+              <w:left w:type="dxa" w:w="110"/>
+              <w:bottom w:type="dxa" w:w="70"/>
+              <w:right w:type="dxa" w:w="110"/>
+            </w:tcMar>
+          </w:tcPr>
+          <w:p>
+            <w:pPr>
+              <w:spacing w:after="0" w:line="250"/>
+            </w:pPr>
+            <w:r>
+              <w:rPr>
+                <w:b w:val="false"/>
+                <w:bCs w:val="false"/>
+                <w:sz w:val="19"/>
+                <w:szCs w:val="19"/>
+              </w:rPr>
+              <w:t xml:space="preserve">Servizio</w:t>
+            </w:r>
+          </w:p>
+        </w:tc>
+        <w:tc>
+          <w:tcPr>
+            <w:tcW w:type="dxa" w:w="2500"/>
+            <w:shd w:fill="F5F7FA" w:val="clear"/>
+            <w:tcMar>
+              <w:top w:type="dxa" w:w="70"/>
+              <w:left w:type="dxa" w:w="110"/>
+              <w:bottom w:type="dxa" w:w="70"/>
+              <w:right w:type="dxa" w:w="110"/>
+            </w:tcMar>
+          </w:tcPr>
+          <w:p>
+            <w:pPr>
+              <w:spacing w:after="0" w:line="250"/>
+            </w:pPr>
+            <w:r>
+              <w:rPr>
+                <w:b w:val="false"/>
+                <w:bCs w:val="false"/>
+                <w:sz w:val="19"/>
+                <w:szCs w:val="19"/>
+              </w:rPr>
+              <w:t xml:space="preserve">purge  (senza argomenti)</w:t>
+            </w:r>
+          </w:p>
+        </w:tc>
+        <w:tc>
+          <w:tcPr>
+            <w:tcW w:type="dxa" w:w="4800"/>
+            <w:shd w:fill="F5F7FA" w:val="clear"/>
+            <w:tcMar>
+              <w:top w:type="dxa" w:w="70"/>
+              <w:left w:type="dxa" w:w="110"/>
+              <w:bottom w:type="dxa" w:w="70"/>
+              <w:right w:type="dxa" w:w="110"/>
+            </w:tcMar>
+          </w:tcPr>
+          <w:p>
+            <w:pPr>
+              <w:spacing w:after="0" w:line="250"/>
+            </w:pPr>
+            <w:r>
+              <w:rPr>
+                <w:b w:val="false"/>
+                <w:bCs w:val="false"/>
+                <w:sz w:val="19"/>
+                <w:szCs w:val="19"/>
+              </w:rPr>
+              <w:t xml:space="preserve">Resta in esecuzione e si autopianifica secondo CronExpression. È dry-run per costruzione: non può cancellare. Chiedere --delete in questa modalità viene rifiutato, non degradato in silenzio a simulazione.</w:t>
             </w:r>
           </w:p>
         </w:tc>
       </w:tr>
     </w:tbl>
+    <w:p>
+      <w:pPr>
+        <w:pBdr>
+          <w:left w:val="single" w:color="8FA3C0" w:sz="18" w:space="12"/>
+        </w:pBdr>
+        <w:spacing w:after="180" w:before="60" w:line="276"/>
+        <w:ind w:left="360"/>
+      </w:pPr>
+      <w:r>
+        <w:rPr>
+          <w:color w:val="44506B"/>
+          <w:sz w:val="20"/>
+          <w:szCs w:val="20"/>
+        </w:rPr>
+        <w:t xml:space="preserve">La finestra oraria vale in entrambe le modalità, anche nell'esecuzione singola. Non è ridondante: lo scheduler decide quando partire, ma solo la finestra decide quando fermarsi. Un avvio fuori finestra esce con codice 4 senza fare nulla, e il log segnala che pianificazione e finestra configurata non concordano.</w:t>
+      </w:r>
+    </w:p>
     <w:p>
       <w:pPr>
         <w:pStyle w:val="Heading2"/>
@@ -8564,7 +8822,1029 @@
           <w:sz w:val="24"/>
           <w:szCs w:val="24"/>
         </w:rPr>
-        <w:t xml:space="preserve">10.3 Codici di uscita</w:t>
+        <w:t xml:space="preserve">10.4 I comandi, uno per uno</w:t>
+      </w:r>
+    </w:p>
+    <w:p>
+      <w:pPr>
+        <w:spacing w:after="200"/>
+      </w:pPr>
+    </w:p>
+    <w:tbl>
+      <w:tblPr>
+        <w:tblW w:type="dxa" w:w="9400"/>
+        <w:tblBorders>
+          <w:top w:val="single" w:color="AAB6C8" w:sz="4"/>
+          <w:left w:val="single" w:color="AAB6C8" w:sz="4"/>
+          <w:bottom w:val="single" w:color="AAB6C8" w:sz="4"/>
+          <w:right w:val="single" w:color="AAB6C8" w:sz="4"/>
+          <w:insideH w:val="single" w:color="CBD4E1" w:sz="2"/>
+          <w:insideV w:val="single" w:color="CBD4E1" w:sz="2"/>
+        </w:tblBorders>
+      </w:tblPr>
+      <w:tblGrid>
+        <w:gridCol w:w="4200"/>
+        <w:gridCol w:w="5200"/>
+      </w:tblGrid>
+      <w:tr>
+        <w:trPr>
+          <w:tblHeader/>
+        </w:trPr>
+        <w:tc>
+          <w:tcPr>
+            <w:tcW w:type="dxa" w:w="4200"/>
+            <w:shd w:fill="E7ECF3" w:val="clear"/>
+            <w:tcMar>
+              <w:top w:type="dxa" w:w="70"/>
+              <w:left w:type="dxa" w:w="110"/>
+              <w:bottom w:type="dxa" w:w="70"/>
+              <w:right w:type="dxa" w:w="110"/>
+            </w:tcMar>
+          </w:tcPr>
+          <w:p>
+            <w:pPr>
+              <w:spacing w:after="0" w:line="250"/>
+            </w:pPr>
+            <w:r>
+              <w:rPr>
+                <w:b/>
+                <w:bCs/>
+                <w:sz w:val="19"/>
+                <w:szCs w:val="19"/>
+              </w:rPr>
+              <w:t xml:space="preserve">Comando</w:t>
+            </w:r>
+          </w:p>
+        </w:tc>
+        <w:tc>
+          <w:tcPr>
+            <w:tcW w:type="dxa" w:w="5200"/>
+            <w:shd w:fill="E7ECF3" w:val="clear"/>
+            <w:tcMar>
+              <w:top w:type="dxa" w:w="70"/>
+              <w:left w:type="dxa" w:w="110"/>
+              <w:bottom w:type="dxa" w:w="70"/>
+              <w:right w:type="dxa" w:w="110"/>
+            </w:tcMar>
+          </w:tcPr>
+          <w:p>
+            <w:pPr>
+              <w:spacing w:after="0" w:line="250"/>
+            </w:pPr>
+            <w:r>
+              <w:rPr>
+                <w:b/>
+                <w:bCs/>
+                <w:sz w:val="19"/>
+                <w:szCs w:val="19"/>
+              </w:rPr>
+              <w:t xml:space="preserve">Effetto</w:t>
+            </w:r>
+          </w:p>
+        </w:tc>
+      </w:tr>
+      <w:tr>
+        <w:tc>
+          <w:tcPr>
+            <w:tcW w:type="dxa" w:w="4200"/>
+            <w:tcMar>
+              <w:top w:type="dxa" w:w="70"/>
+              <w:left w:type="dxa" w:w="110"/>
+              <w:bottom w:type="dxa" w:w="70"/>
+              <w:right w:type="dxa" w:w="110"/>
+            </w:tcMar>
+          </w:tcPr>
+          <w:p>
+            <w:pPr>
+              <w:spacing w:after="0" w:line="250"/>
+            </w:pPr>
+            <w:r>
+              <w:rPr>
+                <w:rFonts w:ascii="Consolas" w:cs="Consolas" w:eastAsia="Consolas" w:hAnsi="Consolas"/>
+                <w:b w:val="false"/>
+                <w:bCs w:val="false"/>
+                <w:sz w:val="17"/>
+                <w:szCs w:val="17"/>
+              </w:rPr>
+              <w:t xml:space="preserve">purge migrate</w:t>
+            </w:r>
+          </w:p>
+        </w:tc>
+        <w:tc>
+          <w:tcPr>
+            <w:tcW w:type="dxa" w:w="5200"/>
+            <w:tcMar>
+              <w:top w:type="dxa" w:w="70"/>
+              <w:left w:type="dxa" w:w="110"/>
+              <w:bottom w:type="dxa" w:w="70"/>
+              <w:right w:type="dxa" w:w="110"/>
+            </w:tcMar>
+          </w:tcPr>
+          <w:p>
+            <w:pPr>
+              <w:spacing w:after="0" w:line="250"/>
+            </w:pPr>
+            <w:r>
+              <w:rPr>
+                <w:b w:val="false"/>
+                <w:bCs w:val="false"/>
+                <w:sz w:val="19"/>
+                <w:szCs w:val="19"/>
+              </w:rPr>
+              <w:t xml:space="preserve">Applica gli script di schema mancanti. Richiede permessi DDL.</w:t>
+            </w:r>
+          </w:p>
+        </w:tc>
+      </w:tr>
+      <w:tr>
+        <w:tc>
+          <w:tcPr>
+            <w:tcW w:type="dxa" w:w="4200"/>
+            <w:shd w:fill="F5F7FA" w:val="clear"/>
+            <w:tcMar>
+              <w:top w:type="dxa" w:w="70"/>
+              <w:left w:type="dxa" w:w="110"/>
+              <w:bottom w:type="dxa" w:w="70"/>
+              <w:right w:type="dxa" w:w="110"/>
+            </w:tcMar>
+          </w:tcPr>
+          <w:p>
+            <w:pPr>
+              <w:spacing w:after="0" w:line="250"/>
+            </w:pPr>
+            <w:r>
+              <w:rPr>
+                <w:rFonts w:ascii="Consolas" w:cs="Consolas" w:eastAsia="Consolas" w:hAnsi="Consolas"/>
+                <w:b w:val="false"/>
+                <w:bCs w:val="false"/>
+                <w:sz w:val="17"/>
+                <w:szCs w:val="17"/>
+              </w:rPr>
+              <w:t xml:space="preserve">purge migrate --status</w:t>
+            </w:r>
+          </w:p>
+        </w:tc>
+        <w:tc>
+          <w:tcPr>
+            <w:tcW w:type="dxa" w:w="5200"/>
+            <w:shd w:fill="F5F7FA" w:val="clear"/>
+            <w:tcMar>
+              <w:top w:type="dxa" w:w="70"/>
+              <w:left w:type="dxa" w:w="110"/>
+              <w:bottom w:type="dxa" w:w="70"/>
+              <w:right w:type="dxa" w:w="110"/>
+            </w:tcMar>
+          </w:tcPr>
+          <w:p>
+            <w:pPr>
+              <w:spacing w:after="0" w:line="250"/>
+            </w:pPr>
+            <w:r>
+              <w:rPr>
+                <w:b w:val="false"/>
+                <w:bCs w:val="false"/>
+                <w:sz w:val="19"/>
+                <w:szCs w:val="19"/>
+              </w:rPr>
+              <w:t xml:space="preserve">Elenca cosa manca senza applicare nulla. Esce con 0 se allineato, 5 altrimenti: utilizzabile come controllo automatico.</w:t>
+            </w:r>
+          </w:p>
+        </w:tc>
+      </w:tr>
+      <w:tr>
+        <w:tc>
+          <w:tcPr>
+            <w:tcW w:type="dxa" w:w="4200"/>
+            <w:tcMar>
+              <w:top w:type="dxa" w:w="70"/>
+              <w:left w:type="dxa" w:w="110"/>
+              <w:bottom w:type="dxa" w:w="70"/>
+              <w:right w:type="dxa" w:w="110"/>
+            </w:tcMar>
+          </w:tcPr>
+          <w:p>
+            <w:pPr>
+              <w:spacing w:after="0" w:line="250"/>
+            </w:pPr>
+            <w:r>
+              <w:rPr>
+                <w:rFonts w:ascii="Consolas" w:cs="Consolas" w:eastAsia="Consolas" w:hAnsi="Consolas"/>
+                <w:b w:val="false"/>
+                <w:bCs w:val="false"/>
+                <w:sz w:val="17"/>
+                <w:szCs w:val="17"/>
+              </w:rPr>
+              <w:t xml:space="preserve">purge once --dry-run</w:t>
+            </w:r>
+          </w:p>
+        </w:tc>
+        <w:tc>
+          <w:tcPr>
+            <w:tcW w:type="dxa" w:w="5200"/>
+            <w:tcMar>
+              <w:top w:type="dxa" w:w="70"/>
+              <w:left w:type="dxa" w:w="110"/>
+              <w:bottom w:type="dxa" w:w="70"/>
+              <w:right w:type="dxa" w:w="110"/>
+            </w:tcMar>
+          </w:tcPr>
+          <w:p>
+            <w:pPr>
+              <w:spacing w:after="0" w:line="250"/>
+            </w:pPr>
+            <w:r>
+              <w:rPr>
+                <w:b w:val="false"/>
+                <w:bCs w:val="false"/>
+                <w:sz w:val="19"/>
+                <w:szCs w:val="19"/>
+              </w:rPr>
+              <w:t xml:space="preserve">Simula tutte le strategie configurate. Nessuna cancellazione, produce il report.</w:t>
+            </w:r>
+          </w:p>
+        </w:tc>
+      </w:tr>
+      <w:tr>
+        <w:tc>
+          <w:tcPr>
+            <w:tcW w:type="dxa" w:w="4200"/>
+            <w:shd w:fill="F5F7FA" w:val="clear"/>
+            <w:tcMar>
+              <w:top w:type="dxa" w:w="70"/>
+              <w:left w:type="dxa" w:w="110"/>
+              <w:bottom w:type="dxa" w:w="70"/>
+              <w:right w:type="dxa" w:w="110"/>
+            </w:tcMar>
+          </w:tcPr>
+          <w:p>
+            <w:pPr>
+              <w:spacing w:after="0" w:line="250"/>
+            </w:pPr>
+            <w:r>
+              <w:rPr>
+                <w:rFonts w:ascii="Consolas" w:cs="Consolas" w:eastAsia="Consolas" w:hAnsi="Consolas"/>
+                <w:b w:val="false"/>
+                <w:bCs w:val="false"/>
+                <w:sz w:val="17"/>
+                <w:szCs w:val="17"/>
+              </w:rPr>
+              <w:t xml:space="preserve">purge once --dry-run Terminated</w:t>
+            </w:r>
+          </w:p>
+        </w:tc>
+        <w:tc>
+          <w:tcPr>
+            <w:tcW w:type="dxa" w:w="5200"/>
+            <w:shd w:fill="F5F7FA" w:val="clear"/>
+            <w:tcMar>
+              <w:top w:type="dxa" w:w="70"/>
+              <w:left w:type="dxa" w:w="110"/>
+              <w:bottom w:type="dxa" w:w="70"/>
+              <w:right w:type="dxa" w:w="110"/>
+            </w:tcMar>
+          </w:tcPr>
+          <w:p>
+            <w:pPr>
+              <w:spacing w:after="0" w:line="250"/>
+            </w:pPr>
+            <w:r>
+              <w:rPr>
+                <w:b w:val="false"/>
+                <w:bCs w:val="false"/>
+                <w:sz w:val="19"/>
+                <w:szCs w:val="19"/>
+              </w:rPr>
+              <w:t xml:space="preserve">Simula una sola strategia.</w:t>
+            </w:r>
+          </w:p>
+        </w:tc>
+      </w:tr>
+      <w:tr>
+        <w:tc>
+          <w:tcPr>
+            <w:tcW w:type="dxa" w:w="4200"/>
+            <w:tcMar>
+              <w:top w:type="dxa" w:w="70"/>
+              <w:left w:type="dxa" w:w="110"/>
+              <w:bottom w:type="dxa" w:w="70"/>
+              <w:right w:type="dxa" w:w="110"/>
+            </w:tcMar>
+          </w:tcPr>
+          <w:p>
+            <w:pPr>
+              <w:spacing w:after="0" w:line="250"/>
+            </w:pPr>
+            <w:r>
+              <w:rPr>
+                <w:rFonts w:ascii="Consolas" w:cs="Consolas" w:eastAsia="Consolas" w:hAnsi="Consolas"/>
+                <w:b w:val="false"/>
+                <w:bCs w:val="false"/>
+                <w:sz w:val="17"/>
+                <w:szCs w:val="17"/>
+              </w:rPr>
+              <w:t xml:space="preserve">purge approve &lt;run-id&gt; --by &lt;nome&gt; [--note &lt;rif&gt;]</w:t>
+            </w:r>
+          </w:p>
+        </w:tc>
+        <w:tc>
+          <w:tcPr>
+            <w:tcW w:type="dxa" w:w="5200"/>
+            <w:tcMar>
+              <w:top w:type="dxa" w:w="70"/>
+              <w:left w:type="dxa" w:w="110"/>
+              <w:bottom w:type="dxa" w:w="70"/>
+              <w:right w:type="dxa" w:w="110"/>
+            </w:tcMar>
+          </w:tcPr>
+          <w:p>
+            <w:pPr>
+              <w:spacing w:after="0" w:line="250"/>
+            </w:pPr>
+            <w:r>
+              <w:rPr>
+                <w:b w:val="false"/>
+                <w:bCs w:val="false"/>
+                <w:sz w:val="19"/>
+                <w:szCs w:val="19"/>
+              </w:rPr>
+              <w:t xml:space="preserve">Registra l'approvazione della policy sotto cui è girato quel dry-run.</w:t>
+            </w:r>
+          </w:p>
+        </w:tc>
+      </w:tr>
+      <w:tr>
+        <w:tc>
+          <w:tcPr>
+            <w:tcW w:type="dxa" w:w="4200"/>
+            <w:shd w:fill="F5F7FA" w:val="clear"/>
+            <w:tcMar>
+              <w:top w:type="dxa" w:w="70"/>
+              <w:left w:type="dxa" w:w="110"/>
+              <w:bottom w:type="dxa" w:w="70"/>
+              <w:right w:type="dxa" w:w="110"/>
+            </w:tcMar>
+          </w:tcPr>
+          <w:p>
+            <w:pPr>
+              <w:spacing w:after="0" w:line="250"/>
+            </w:pPr>
+            <w:r>
+              <w:rPr>
+                <w:rFonts w:ascii="Consolas" w:cs="Consolas" w:eastAsia="Consolas" w:hAnsi="Consolas"/>
+                <w:b w:val="false"/>
+                <w:bCs w:val="false"/>
+                <w:sz w:val="17"/>
+                <w:szCs w:val="17"/>
+              </w:rPr>
+              <w:t xml:space="preserve">purge once --delete</w:t>
+            </w:r>
+          </w:p>
+        </w:tc>
+        <w:tc>
+          <w:tcPr>
+            <w:tcW w:type="dxa" w:w="5200"/>
+            <w:shd w:fill="F5F7FA" w:val="clear"/>
+            <w:tcMar>
+              <w:top w:type="dxa" w:w="70"/>
+              <w:left w:type="dxa" w:w="110"/>
+              <w:bottom w:type="dxa" w:w="70"/>
+              <w:right w:type="dxa" w:w="110"/>
+            </w:tcMar>
+          </w:tcPr>
+          <w:p>
+            <w:pPr>
+              <w:spacing w:after="0" w:line="250"/>
+            </w:pPr>
+            <w:r>
+              <w:rPr>
+                <w:b w:val="false"/>
+                <w:bCs w:val="false"/>
+                <w:sz w:val="19"/>
+                <w:szCs w:val="19"/>
+              </w:rPr>
+              <w:t xml:space="preserve">Esecuzione reale, tutte le strategie configurate.</w:t>
+            </w:r>
+          </w:p>
+        </w:tc>
+      </w:tr>
+      <w:tr>
+        <w:tc>
+          <w:tcPr>
+            <w:tcW w:type="dxa" w:w="4200"/>
+            <w:tcMar>
+              <w:top w:type="dxa" w:w="70"/>
+              <w:left w:type="dxa" w:w="110"/>
+              <w:bottom w:type="dxa" w:w="70"/>
+              <w:right w:type="dxa" w:w="110"/>
+            </w:tcMar>
+          </w:tcPr>
+          <w:p>
+            <w:pPr>
+              <w:spacing w:after="0" w:line="250"/>
+            </w:pPr>
+            <w:r>
+              <w:rPr>
+                <w:rFonts w:ascii="Consolas" w:cs="Consolas" w:eastAsia="Consolas" w:hAnsi="Consolas"/>
+                <w:b w:val="false"/>
+                <w:bCs w:val="false"/>
+                <w:sz w:val="17"/>
+                <w:szCs w:val="17"/>
+              </w:rPr>
+              <w:t xml:space="preserve">purge once --delete OrphanHistory</w:t>
+            </w:r>
+          </w:p>
+        </w:tc>
+        <w:tc>
+          <w:tcPr>
+            <w:tcW w:type="dxa" w:w="5200"/>
+            <w:tcMar>
+              <w:top w:type="dxa" w:w="70"/>
+              <w:left w:type="dxa" w:w="110"/>
+              <w:bottom w:type="dxa" w:w="70"/>
+              <w:right w:type="dxa" w:w="110"/>
+            </w:tcMar>
+          </w:tcPr>
+          <w:p>
+            <w:pPr>
+              <w:spacing w:after="0" w:line="250"/>
+            </w:pPr>
+            <w:r>
+              <w:rPr>
+                <w:b w:val="false"/>
+                <w:bCs w:val="false"/>
+                <w:sz w:val="19"/>
+                <w:szCs w:val="19"/>
+              </w:rPr>
+              <w:t xml:space="preserve">Esecuzione reale di una sola strategia.</w:t>
+            </w:r>
+          </w:p>
+        </w:tc>
+      </w:tr>
+      <w:tr>
+        <w:tc>
+          <w:tcPr>
+            <w:tcW w:type="dxa" w:w="4200"/>
+            <w:shd w:fill="F5F7FA" w:val="clear"/>
+            <w:tcMar>
+              <w:top w:type="dxa" w:w="70"/>
+              <w:left w:type="dxa" w:w="110"/>
+              <w:bottom w:type="dxa" w:w="70"/>
+              <w:right w:type="dxa" w:w="110"/>
+            </w:tcMar>
+          </w:tcPr>
+          <w:p>
+            <w:pPr>
+              <w:spacing w:after="0" w:line="250"/>
+            </w:pPr>
+            <w:r>
+              <w:rPr>
+                <w:rFonts w:ascii="Consolas" w:cs="Consolas" w:eastAsia="Consolas" w:hAnsi="Consolas"/>
+                <w:b w:val="false"/>
+                <w:bCs w:val="false"/>
+                <w:sz w:val="17"/>
+                <w:szCs w:val="17"/>
+              </w:rPr>
+              <w:t xml:space="preserve">purge once --delete --no-window</w:t>
+            </w:r>
+          </w:p>
+        </w:tc>
+        <w:tc>
+          <w:tcPr>
+            <w:tcW w:type="dxa" w:w="5200"/>
+            <w:shd w:fill="F5F7FA" w:val="clear"/>
+            <w:tcMar>
+              <w:top w:type="dxa" w:w="70"/>
+              <w:left w:type="dxa" w:w="110"/>
+              <w:bottom w:type="dxa" w:w="70"/>
+              <w:right w:type="dxa" w:w="110"/>
+            </w:tcMar>
+          </w:tcPr>
+          <w:p>
+            <w:pPr>
+              <w:spacing w:after="0" w:line="250"/>
+            </w:pPr>
+            <w:r>
+              <w:rPr>
+                <w:b w:val="false"/>
+                <w:bCs w:val="false"/>
+                <w:sz w:val="19"/>
+                <w:szCs w:val="19"/>
+              </w:rPr>
+              <w:t xml:space="preserve">Esecuzione reale senza il limite di fine finestra.</w:t>
+            </w:r>
+          </w:p>
+        </w:tc>
+      </w:tr>
+      <w:tr>
+        <w:tc>
+          <w:tcPr>
+            <w:tcW w:type="dxa" w:w="4200"/>
+            <w:tcMar>
+              <w:top w:type="dxa" w:w="70"/>
+              <w:left w:type="dxa" w:w="110"/>
+              <w:bottom w:type="dxa" w:w="70"/>
+              <w:right w:type="dxa" w:w="110"/>
+            </w:tcMar>
+          </w:tcPr>
+          <w:p>
+            <w:pPr>
+              <w:spacing w:after="0" w:line="250"/>
+            </w:pPr>
+            <w:r>
+              <w:rPr>
+                <w:rFonts w:ascii="Consolas" w:cs="Consolas" w:eastAsia="Consolas" w:hAnsi="Consolas"/>
+                <w:b w:val="false"/>
+                <w:bCs w:val="false"/>
+                <w:sz w:val="17"/>
+                <w:szCs w:val="17"/>
+              </w:rPr>
+              <w:t xml:space="preserve">purge</w:t>
+            </w:r>
+          </w:p>
+        </w:tc>
+        <w:tc>
+          <w:tcPr>
+            <w:tcW w:type="dxa" w:w="5200"/>
+            <w:tcMar>
+              <w:top w:type="dxa" w:w="70"/>
+              <w:left w:type="dxa" w:w="110"/>
+              <w:bottom w:type="dxa" w:w="70"/>
+              <w:right w:type="dxa" w:w="110"/>
+            </w:tcMar>
+          </w:tcPr>
+          <w:p>
+            <w:pPr>
+              <w:spacing w:after="0" w:line="250"/>
+            </w:pPr>
+            <w:r>
+              <w:rPr>
+                <w:b w:val="false"/>
+                <w:bCs w:val="false"/>
+                <w:sz w:val="19"/>
+                <w:szCs w:val="19"/>
+              </w:rPr>
+              <w:t xml:space="preserve">Servizio con pianificazione interna, in sola simulazione.</w:t>
+            </w:r>
+          </w:p>
+        </w:tc>
+      </w:tr>
+    </w:tbl>
+    <w:p>
+      <w:pPr>
+        <w:spacing w:after="140" w:line="276"/>
+      </w:pPr>
+      <w:r>
+        <w:rPr>
+          <w:sz w:val="21"/>
+          <w:szCs w:val="21"/>
+        </w:rPr>
+        <w:t xml:space="preserve">Il nome della strategia, quando presente, va subito dopo la modalità e non distingue maiuscole e minuscole. I valori ammessi sono </w:t>
+      </w:r>
+      <w:r>
+        <w:rPr>
+          <w:rFonts w:ascii="Consolas" w:cs="Consolas" w:eastAsia="Consolas" w:hAnsi="Consolas"/>
+          <w:color w:val="20304A"/>
+          <w:sz w:val="21"/>
+          <w:szCs w:val="21"/>
+        </w:rPr>
+        <w:t xml:space="preserve">Terminated</w:t>
+      </w:r>
+      <w:r>
+        <w:rPr>
+          <w:sz w:val="21"/>
+          <w:szCs w:val="21"/>
+        </w:rPr>
+        <w:t xml:space="preserve">, </w:t>
+      </w:r>
+      <w:r>
+        <w:rPr>
+          <w:rFonts w:ascii="Consolas" w:cs="Consolas" w:eastAsia="Consolas" w:hAnsi="Consolas"/>
+          <w:color w:val="20304A"/>
+          <w:sz w:val="21"/>
+          <w:szCs w:val="21"/>
+        </w:rPr>
+        <w:t xml:space="preserve">StandingOrders</w:t>
+      </w:r>
+      <w:r>
+        <w:rPr>
+          <w:sz w:val="21"/>
+          <w:szCs w:val="21"/>
+        </w:rPr>
+        <w:t xml:space="preserve">, </w:t>
+      </w:r>
+      <w:r>
+        <w:rPr>
+          <w:rFonts w:ascii="Consolas" w:cs="Consolas" w:eastAsia="Consolas" w:hAnsi="Consolas"/>
+          <w:color w:val="20304A"/>
+          <w:sz w:val="21"/>
+          <w:szCs w:val="21"/>
+        </w:rPr>
+        <w:t xml:space="preserve">Collective</w:t>
+      </w:r>
+      <w:r>
+        <w:rPr>
+          <w:sz w:val="21"/>
+          <w:szCs w:val="21"/>
+        </w:rPr>
+        <w:t xml:space="preserve">, </w:t>
+      </w:r>
+      <w:r>
+        <w:rPr>
+          <w:rFonts w:ascii="Consolas" w:cs="Consolas" w:eastAsia="Consolas" w:hAnsi="Consolas"/>
+          <w:color w:val="20304A"/>
+          <w:sz w:val="21"/>
+          <w:szCs w:val="21"/>
+        </w:rPr>
+        <w:t xml:space="preserve">OrphanHistory</w:t>
+      </w:r>
+      <w:r>
+        <w:rPr>
+          <w:sz w:val="21"/>
+          <w:szCs w:val="21"/>
+        </w:rPr>
+        <w:t xml:space="preserve">, </w:t>
+      </w:r>
+      <w:r>
+        <w:rPr>
+          <w:rFonts w:ascii="Consolas" w:cs="Consolas" w:eastAsia="Consolas" w:hAnsi="Consolas"/>
+          <w:color w:val="20304A"/>
+          <w:sz w:val="21"/>
+          <w:szCs w:val="21"/>
+        </w:rPr>
+        <w:t xml:space="preserve">Abandoned</w:t>
+      </w:r>
+      <w:r>
+        <w:rPr>
+          <w:sz w:val="21"/>
+          <w:szCs w:val="21"/>
+        </w:rPr>
+        <w:t xml:space="preserve">. Omettendolo si eseguono tutte le strategie configurate, in sequenza, ciascuna come run separato con un proprio identificatore.</w:t>
+      </w:r>
+    </w:p>
+    <w:p>
+      <w:pPr>
+        <w:spacing w:after="140" w:line="276"/>
+      </w:pPr>
+      <w:r>
+        <w:rPr>
+          <w:rFonts w:ascii="Consolas" w:cs="Consolas" w:eastAsia="Consolas" w:hAnsi="Consolas"/>
+          <w:color w:val="20304A"/>
+          <w:sz w:val="21"/>
+          <w:szCs w:val="21"/>
+        </w:rPr>
+        <w:t xml:space="preserve">--no-window</w:t>
+      </w:r>
+      <w:r>
+        <w:rPr>
+          <w:sz w:val="21"/>
+          <w:szCs w:val="21"/>
+        </w:rPr>
+        <w:t xml:space="preserve"> rinuncia al limite di fine finestra. Esiste per i recuperi e i collaudi, viene registrato nel log come richiesta esplicita, e con </w:t>
+      </w:r>
+      <w:r>
+        <w:rPr>
+          <w:rFonts w:ascii="Consolas" w:cs="Consolas" w:eastAsia="Consolas" w:hAnsi="Consolas"/>
+          <w:color w:val="20304A"/>
+          <w:sz w:val="21"/>
+          <w:szCs w:val="21"/>
+        </w:rPr>
+        <w:t xml:space="preserve">--delete</w:t>
+      </w:r>
+      <w:r>
+        <w:rPr>
+          <w:sz w:val="21"/>
+          <w:szCs w:val="21"/>
+        </w:rPr>
+        <w:t xml:space="preserve"> in produzione non andrebbe usato senza una ragione scritta: la finestra è ciò che tiene il purge lontano dall'operatività.</w:t>
+      </w:r>
+    </w:p>
+    <w:p>
+      <w:pPr>
+        <w:pBdr>
+          <w:left w:val="single" w:color="8FA3C0" w:sz="18" w:space="12"/>
+        </w:pBdr>
+        <w:spacing w:after="180" w:before="60" w:line="276"/>
+        <w:ind w:left="360"/>
+      </w:pPr>
+      <w:r>
+        <w:rPr>
+          <w:color w:val="44506B"/>
+          <w:sz w:val="20"/>
+          <w:szCs w:val="20"/>
+        </w:rPr>
+        <w:t xml:space="preserve">Un'istanza alla volta: all'avvio il motore prende un lock applicativo sul database. Se un'altra istanza sta già girando, il processo esce subito con codice 0 e un avviso nel log — non fallisce, perché una sovrapposizione dello scheduler non è un errore da segnalare come tale.</w:t>
+      </w:r>
+    </w:p>
+    <w:p>
+      <w:pPr>
+        <w:pStyle w:val="Heading2"/>
+        <w:spacing w:after="120" w:before="260"/>
+      </w:pPr>
+      <w:r>
+        <w:rPr>
+          <w:b/>
+          <w:bCs/>
+          <w:color w:val="1F3864"/>
+          <w:sz w:val="24"/>
+          <w:szCs w:val="24"/>
+        </w:rPr>
+        <w:t xml:space="preserve">10.5 Sessioni tipo</w:t>
+      </w:r>
+    </w:p>
+    <w:p>
+      <w:pPr>
+        <w:pStyle w:val="Heading3"/>
+        <w:spacing w:after="100" w:before="200"/>
+      </w:pPr>
+      <w:r>
+        <w:rPr>
+          <w:b/>
+          <w:bCs/>
+          <w:color w:val="2E4570"/>
+          <w:sz w:val="22"/>
+          <w:szCs w:val="22"/>
+        </w:rPr>
+        <w:t xml:space="preserve">Prima installazione su un database nuovo</w:t>
+      </w:r>
+    </w:p>
+    <w:p>
+      <w:pPr>
+        <w:shd w:fill="F2F4F7" w:val="clear"/>
+        <w:spacing w:after="0" w:line="240"/>
+        <w:ind w:left="360"/>
+      </w:pPr>
+      <w:r>
+        <w:rPr>
+          <w:rFonts w:ascii="Consolas" w:cs="Consolas" w:eastAsia="Consolas" w:hAnsi="Consolas"/>
+          <w:color w:val="20304A"/>
+          <w:sz w:val="18"/>
+          <w:szCs w:val="18"/>
+        </w:rPr>
+        <w:t xml:space="preserve">purge migrate --status                            # cosa manca</w:t>
+      </w:r>
+    </w:p>
+    <w:p>
+      <w:pPr>
+        <w:shd w:fill="F2F4F7" w:val="clear"/>
+        <w:spacing w:after="0" w:line="240"/>
+        <w:ind w:left="360"/>
+      </w:pPr>
+      <w:r>
+        <w:rPr>
+          <w:rFonts w:ascii="Consolas" w:cs="Consolas" w:eastAsia="Consolas" w:hAnsi="Consolas"/>
+          <w:color w:val="20304A"/>
+          <w:sz w:val="18"/>
+          <w:szCs w:val="18"/>
+        </w:rPr>
+        <w:t xml:space="preserve">purge migrate                                     # applica</w:t>
+      </w:r>
+    </w:p>
+    <w:p>
+      <w:pPr>
+        <w:shd w:fill="F2F4F7" w:val="clear"/>
+        <w:spacing w:after="0" w:line="240"/>
+        <w:ind w:left="360"/>
+      </w:pPr>
+      <w:r>
+        <w:rPr>
+          <w:rFonts w:ascii="Consolas" w:cs="Consolas" w:eastAsia="Consolas" w:hAnsi="Consolas"/>
+          <w:color w:val="20304A"/>
+          <w:sz w:val="18"/>
+          <w:szCs w:val="18"/>
+        </w:rPr>
+        <w:t xml:space="preserve">purge once --dry-run OrphanHistory --no-window    # prova di fumo, di giorno</w:t>
+      </w:r>
+    </w:p>
+    <w:p>
+      <w:pPr>
+        <w:shd w:fill="F2F4F7" w:val="clear"/>
+        <w:spacing w:after="160" w:line="240"/>
+        <w:ind w:left="360"/>
+      </w:pPr>
+      <w:r>
+        <w:rPr>
+          <w:rFonts w:ascii="Consolas" w:cs="Consolas" w:eastAsia="Consolas" w:hAnsi="Consolas"/>
+          <w:color w:val="20304A"/>
+          <w:sz w:val="18"/>
+          <w:szCs w:val="18"/>
+        </w:rPr>
+        <w:t xml:space="preserve">purge once --dry-run                              # simulazione completa, di notte</w:t>
+      </w:r>
+    </w:p>
+    <w:p>
+      <w:pPr>
+        <w:pStyle w:val="Heading3"/>
+        <w:spacing w:after="100" w:before="200"/>
+      </w:pPr>
+      <w:r>
+        <w:rPr>
+          <w:b/>
+          <w:bCs/>
+          <w:color w:val="2E4570"/>
+          <w:sz w:val="22"/>
+          <w:szCs w:val="22"/>
+        </w:rPr>
+        <w:t xml:space="preserve">Dalla simulazione alla prima cancellazione</w:t>
+      </w:r>
+    </w:p>
+    <w:p>
+      <w:pPr>
+        <w:shd w:fill="F2F4F7" w:val="clear"/>
+        <w:spacing w:after="0" w:line="240"/>
+        <w:ind w:left="360"/>
+      </w:pPr>
+      <w:r>
+        <w:rPr>
+          <w:rFonts w:ascii="Consolas" w:cs="Consolas" w:eastAsia="Consolas" w:hAnsi="Consolas"/>
+          <w:color w:val="20304A"/>
+          <w:sz w:val="18"/>
+          <w:szCs w:val="18"/>
+        </w:rPr>
+        <w:t xml:space="preserve">purge once --dry-run                              # produce il report</w:t>
+      </w:r>
+    </w:p>
+    <w:p>
+      <w:pPr>
+        <w:shd w:fill="F2F4F7" w:val="clear"/>
+        <w:spacing w:after="0" w:line="240"/>
+        <w:ind w:left="360"/>
+      </w:pPr>
+      <w:r>
+        <w:rPr>
+          <w:rFonts w:ascii="Consolas" w:cs="Consolas" w:eastAsia="Consolas" w:hAnsi="Consolas"/>
+          <w:color w:val="20304A"/>
+          <w:sz w:val="18"/>
+          <w:szCs w:val="18"/>
+        </w:rPr>
+        <w:t xml:space="preserve">#    [ esame del report con Compliance ]</w:t>
+      </w:r>
+    </w:p>
+    <w:p>
+      <w:pPr>
+        <w:shd w:fill="F2F4F7" w:val="clear"/>
+        <w:spacing w:after="0" w:line="240"/>
+        <w:ind w:left="360"/>
+      </w:pPr>
+      <w:r>
+        <w:rPr>
+          <w:rFonts w:ascii="Consolas" w:cs="Consolas" w:eastAsia="Consolas" w:hAnsi="Consolas"/>
+          <w:color w:val="20304A"/>
+          <w:sz w:val="18"/>
+          <w:szCs w:val="18"/>
+        </w:rPr>
+        <w:t xml:space="preserve">purge approve 3f2a... --by "M. Rossi" --note "CR-1487"</w:t>
+      </w:r>
+    </w:p>
+    <w:p>
+      <w:pPr>
+        <w:shd w:fill="F2F4F7" w:val="clear"/>
+        <w:spacing w:after="0" w:line="240"/>
+        <w:ind w:left="360"/>
+      </w:pPr>
+      <w:r>
+        <w:rPr>
+          <w:rFonts w:ascii="Consolas" w:cs="Consolas" w:eastAsia="Consolas" w:hAnsi="Consolas"/>
+          <w:color w:val="20304A"/>
+          <w:sz w:val="18"/>
+          <w:szCs w:val="18"/>
+        </w:rPr>
+        <w:t xml:space="preserve">#    [ il DBA concede DELETE all'utenza del purge ]</w:t>
+      </w:r>
+    </w:p>
+    <w:p>
+      <w:pPr>
+        <w:shd w:fill="F2F4F7" w:val="clear"/>
+        <w:spacing w:after="0" w:line="240"/>
+        <w:ind w:left="360"/>
+      </w:pPr>
+      <w:r>
+        <w:rPr>
+          <w:rFonts w:ascii="Consolas" w:cs="Consolas" w:eastAsia="Consolas" w:hAnsi="Consolas"/>
+          <w:color w:val="20304A"/>
+          <w:sz w:val="18"/>
+          <w:szCs w:val="18"/>
+        </w:rPr>
+        <w:t xml:space="preserve">purge once --delete OrphanHistory                 # prima notte, una strategia</w:t>
+      </w:r>
+    </w:p>
+    <w:p>
+      <w:pPr>
+        <w:shd w:fill="F2F4F7" w:val="clear"/>
+        <w:spacing w:after="160" w:line="240"/>
+        <w:ind w:left="360"/>
+      </w:pPr>
+      <w:r>
+        <w:rPr>
+          <w:rFonts w:ascii="Consolas" w:cs="Consolas" w:eastAsia="Consolas" w:hAnsi="Consolas"/>
+          <w:color w:val="20304A"/>
+          <w:sz w:val="18"/>
+          <w:szCs w:val="18"/>
+        </w:rPr>
+        <w:t xml:space="preserve">purge once --delete                               # a regime, tutte</w:t>
+      </w:r>
+    </w:p>
+    <w:p>
+      <w:pPr>
+        <w:pStyle w:val="Heading3"/>
+        <w:spacing w:after="100" w:before="200"/>
+      </w:pPr>
+      <w:r>
+        <w:rPr>
+          <w:b/>
+          <w:bCs/>
+          <w:color w:val="2E4570"/>
+          <w:sz w:val="22"/>
+          <w:szCs w:val="22"/>
+        </w:rPr>
+        <w:t xml:space="preserve">Un run interrotto che riprende</w:t>
+      </w:r>
+    </w:p>
+    <w:p>
+      <w:pPr>
+        <w:spacing w:after="140" w:line="276"/>
+      </w:pPr>
+      <w:r>
+        <w:rPr>
+          <w:sz w:val="21"/>
+          <w:szCs w:val="21"/>
+        </w:rPr>
+        <w:t xml:space="preserve">Nessun comando speciale: si rilancia lo stesso comando. Il motore trova il run non concluso e riparte dal checkpoint, sullo stesso insieme di candidati congelato.</w:t>
+      </w:r>
+    </w:p>
+    <w:p>
+      <w:pPr>
+        <w:shd w:fill="F2F4F7" w:val="clear"/>
+        <w:spacing w:after="0" w:line="240"/>
+        <w:ind w:left="360"/>
+      </w:pPr>
+      <w:r>
+        <w:rPr>
+          <w:rFonts w:ascii="Consolas" w:cs="Consolas" w:eastAsia="Consolas" w:hAnsi="Consolas"/>
+          <w:color w:val="20304A"/>
+          <w:sz w:val="18"/>
+          <w:szCs w:val="18"/>
+        </w:rPr>
+        <w:t xml:space="preserve">purge once --delete                               # esce con 5: finestra superata</w:t>
+      </w:r>
+    </w:p>
+    <w:p>
+      <w:pPr>
+        <w:shd w:fill="F2F4F7" w:val="clear"/>
+        <w:spacing w:after="0" w:line="240"/>
+        <w:ind w:left="360"/>
+      </w:pPr>
+      <w:r>
+        <w:rPr>
+          <w:rFonts w:ascii="Consolas" w:cs="Consolas" w:eastAsia="Consolas" w:hAnsi="Consolas"/>
+          <w:color w:val="20304A"/>
+          <w:sz w:val="18"/>
+          <w:szCs w:val="18"/>
+        </w:rPr>
+        <w:t xml:space="preserve">#    [ la notte successiva, stesso comando ]</w:t>
+      </w:r>
+    </w:p>
+    <w:p>
+      <w:pPr>
+        <w:shd w:fill="F2F4F7" w:val="clear"/>
+        <w:spacing w:after="160" w:line="240"/>
+        <w:ind w:left="360"/>
+      </w:pPr>
+      <w:r>
+        <w:rPr>
+          <w:rFonts w:ascii="Consolas" w:cs="Consolas" w:eastAsia="Consolas" w:hAnsi="Consolas"/>
+          <w:color w:val="20304A"/>
+          <w:sz w:val="18"/>
+          <w:szCs w:val="18"/>
+        </w:rPr>
+        <w:t xml:space="preserve">purge once --delete                               # riprende da dove si era fermato</w:t>
+      </w:r>
+    </w:p>
+    <w:p>
+      <w:pPr>
+        <w:pStyle w:val="Heading2"/>
+        <w:spacing w:after="120" w:before="260"/>
+      </w:pPr>
+      <w:r>
+        <w:rPr>
+          <w:b/>
+          <w:bCs/>
+          <w:color w:val="1F3864"/>
+          <w:sz w:val="24"/>
+          <w:szCs w:val="24"/>
+        </w:rPr>
+        <w:t xml:space="preserve">10.6 Codici di uscita</w:t>
+      </w:r>
+    </w:p>
+    <w:p>
+      <w:pPr>
+        <w:spacing w:after="140" w:line="276"/>
+      </w:pPr>
+      <w:r>
+        <w:rPr>
+          <w:sz w:val="21"/>
+          <w:szCs w:val="21"/>
+        </w:rPr>
+        <w:t xml:space="preserve">L'esecuzione singola comunica l'esito allo scheduler tramite il codice di uscita. Due di questi non sono guasti.</w:t>
       </w:r>
     </w:p>
     <w:p>
@@ -8876,7 +10156,7 @@
                 <w:sz w:val="19"/>
                 <w:szCs w:val="19"/>
               </w:rPr>
-              <w:t xml:space="preserve">Configurazione o schema non validi</w:t>
+              <w:t xml:space="preserve">Modalità assente, configurazione o schema non validi</w:t>
             </w:r>
           </w:p>
         </w:tc>
@@ -8955,7 +10235,7 @@
                 <w:sz w:val="19"/>
                 <w:szCs w:val="19"/>
               </w:rPr>
-              <w:t xml:space="preserve">Fuori dalla finestra oraria</w:t>
+              <w:t xml:space="preserve">Avvio fuori dalla finestra oraria</w:t>
             </w:r>
           </w:p>
         </w:tc>
@@ -9058,7 +10338,7 @@
                 <w:sz w:val="19"/>
                 <w:szCs w:val="19"/>
               </w:rPr>
-              <w:t xml:space="preserve">Normale sui volumi grandi: riprende la notte dopo</w:t>
+              <w:t xml:space="preserve">Non è un guasto: riprende la notte dopo</w:t>
             </w:r>
           </w:p>
         </w:tc>
@@ -9112,7 +10392,7 @@
                 <w:sz w:val="19"/>
                 <w:szCs w:val="19"/>
               </w:rPr>
-              <w:t xml:space="preserve">Interrotto</w:t>
+              <w:t xml:space="preserve">Interrotto (Ctrl-C o arresto del job)</w:t>
             </w:r>
           </w:p>
         </w:tc>
@@ -9138,12 +10418,29 @@
                 <w:sz w:val="19"/>
                 <w:szCs w:val="19"/>
               </w:rPr>
-              <w:t xml:space="preserve">Riprende dal checkpoint</w:t>
+              <w:t xml:space="preserve">Non è un guasto: riprende dal checkpoint</w:t>
             </w:r>
           </w:p>
         </w:tc>
       </w:tr>
     </w:tbl>
+    <w:p>
+      <w:pPr>
+        <w:pBdr>
+          <w:left w:val="single" w:color="8FA3C0" w:sz="18" w:space="12"/>
+        </w:pBdr>
+        <w:spacing w:after="180" w:before="60" w:line="276"/>
+        <w:ind w:left="360"/>
+      </w:pPr>
+      <w:r>
+        <w:rPr>
+          <w:color w:val="44506B"/>
+          <w:sz w:val="20"/>
+          <w:szCs w:val="20"/>
+        </w:rPr>
+        <w:t xml:space="preserve">Sui volumi di produzione le prime notti finiranno quasi sempre con 5. Chi sorveglia i job va avvisato in anticipo, altrimenti il primo 5 viene trattato come un incidente.</w:t>
+      </w:r>
+    </w:p>
     <w:p>
       <w:pPr>
         <w:pStyle w:val="Heading2"/>
@@ -9157,7 +10454,7 @@
           <w:sz w:val="24"/>
           <w:szCs w:val="24"/>
         </w:rPr>
-        <w:t xml:space="preserve">10.4 Osservabilità</w:t>
+        <w:t xml:space="preserve">10.7 Osservabilità</w:t>
       </w:r>
     </w:p>
     <w:p>
@@ -9229,7 +10526,7 @@
           <w:sz w:val="24"/>
           <w:szCs w:val="24"/>
         </w:rPr>
-        <w:t xml:space="preserve">10.5 Procedure operative</w:t>
+        <w:t xml:space="preserve">10.8 Procedure operative</w:t>
       </w:r>
     </w:p>
     <w:p>

</xml_diff>

<commit_message>
Documento: PurgeStartupGuard fra i componenti e nel capitolo sicurezza
Da una revisione sul commit 66adcad. Il codice aveva introdotto un
componente architetturalmente rilevante che il documento non nominava: il
confine Program -> PurgeStartupGuard -> PurgeApprovalGate.

- riga nella tabella dei componenti (§3.1), con cio' che la guardia NON fa:
  non decide se la policy e' approvata, quello e' il livello successivo
- sezione in §9.1: perche' i controlli di configurazione precedono
  l'approvazione (i due rifiuti mandano chi legge in direzioni opposte) e
  perche' la guardia e' una funzione separata invece di un blocco nel punto
  di ingresso — con il difetto che lo ha insegnato
- nota sulla differenza fra test di collegamento e test comportamentali

Tolto il conteggio 'otto casi' dal changelog e da decisioni.md: erano nove
invocazioni, e un numero nel testo e' una cosa in piu' da tenere allineata
senza che serva a nessuno.
</commit_message>
<xml_diff>
--- a/docs/architettura/Architecture-Functional-Design-Sfoltimento-2026-09-09.docx
+++ b/docs/architettura/Architecture-Functional-Design-Sfoltimento-2026-09-09.docx
@@ -1931,7 +1931,7 @@
                 <w:sz w:val="19"/>
                 <w:szCs w:val="19"/>
               </w:rPr>
-              <w:t xml:space="preserve">RetentionOrchestrator</w:t>
+              <w:t xml:space="preserve">PurgeStartupGuard</w:t>
             </w:r>
           </w:p>
         </w:tc>
@@ -1957,7 +1957,7 @@
                 <w:sz w:val="19"/>
                 <w:szCs w:val="19"/>
               </w:rPr>
-              <w:t xml:space="preserve">Governa il workflow: esegue una fase, persiste la transizione, gestisce interruzioni e ripresa</w:t>
+              <w:t xml:space="preserve">I controlli di configurazione che precedono ogni cancellazione reale</w:t>
             </w:r>
           </w:p>
         </w:tc>
@@ -1983,7 +1983,7 @@
                 <w:sz w:val="19"/>
                 <w:szCs w:val="19"/>
               </w:rPr>
-              <w:t xml:space="preserve">Non esegue SQL di dominio</w:t>
+              <w:t xml:space="preserve">Non decide se la policy è approvata: è il livello successivo</w:t>
             </w:r>
           </w:p>
         </w:tc>
@@ -2010,7 +2010,7 @@
                 <w:sz w:val="19"/>
                 <w:szCs w:val="19"/>
               </w:rPr>
-              <w:t xml:space="preserve">IPurgeStrategy</w:t>
+              <w:t xml:space="preserve">RetentionOrchestrator</w:t>
             </w:r>
           </w:p>
         </w:tc>
@@ -2035,7 +2035,7 @@
                 <w:sz w:val="19"/>
                 <w:szCs w:val="19"/>
               </w:rPr>
-              <w:t xml:space="preserve">Definisce l'eleggibilità: quali aggregati entrano nel run</w:t>
+              <w:t xml:space="preserve">Governa il workflow: esegue una fase, persiste la transizione, gestisce interruzioni e ripresa</w:t>
             </w:r>
           </w:p>
         </w:tc>
@@ -2060,7 +2060,7 @@
                 <w:sz w:val="19"/>
                 <w:szCs w:val="19"/>
               </w:rPr>
-              <w:t xml:space="preserve">Non decide come e quando cancellarli</w:t>
+              <w:t xml:space="preserve">Non esegue SQL di dominio</w:t>
             </w:r>
           </w:p>
         </w:tc>
@@ -2088,7 +2088,7 @@
                 <w:sz w:val="19"/>
                 <w:szCs w:val="19"/>
               </w:rPr>
-              <w:t xml:space="preserve">BatchPlanner</w:t>
+              <w:t xml:space="preserve">IPurgeStrategy</w:t>
             </w:r>
           </w:p>
         </w:tc>
@@ -2114,7 +2114,7 @@
                 <w:sz w:val="19"/>
                 <w:szCs w:val="19"/>
               </w:rPr>
-              <w:t xml:space="preserve">Legge i candidati a pagine e li dà in pasto al packer</w:t>
+              <w:t xml:space="preserve">Definisce l'eleggibilità: quali aggregati entrano nel run</w:t>
             </w:r>
           </w:p>
         </w:tc>
@@ -2140,7 +2140,7 @@
                 <w:sz w:val="19"/>
                 <w:szCs w:val="19"/>
               </w:rPr>
-              <w:t xml:space="preserve">Non decide la composizione delle slice</w:t>
+              <w:t xml:space="preserve">Non decide come e quando cancellarli</w:t>
             </w:r>
           </w:p>
         </w:tc>
@@ -2167,7 +2167,7 @@
                 <w:sz w:val="19"/>
                 <w:szCs w:val="19"/>
               </w:rPr>
-              <w:t xml:space="preserve">BatchPacker</w:t>
+              <w:t xml:space="preserve">BatchPlanner</w:t>
             </w:r>
           </w:p>
         </w:tc>
@@ -2192,7 +2192,7 @@
                 <w:sz w:val="19"/>
                 <w:szCs w:val="19"/>
               </w:rPr>
-              <w:t xml:space="preserve">Assegna i candidati alle slice rispettando i limiti</w:t>
+              <w:t xml:space="preserve">Legge i candidati a pagine e li dà in pasto al packer</w:t>
             </w:r>
           </w:p>
         </w:tc>
@@ -2217,7 +2217,7 @@
                 <w:sz w:val="19"/>
                 <w:szCs w:val="19"/>
               </w:rPr>
-              <w:t xml:space="preserve">Non accede al database: deterministico e privo di I/O</w:t>
+              <w:t xml:space="preserve">Non decide la composizione delle slice</w:t>
             </w:r>
           </w:p>
         </w:tc>
@@ -2245,7 +2245,7 @@
                 <w:sz w:val="19"/>
                 <w:szCs w:val="19"/>
               </w:rPr>
-              <w:t xml:space="preserve">BatchExecutionCoordinator</w:t>
+              <w:t xml:space="preserve">BatchPacker</w:t>
             </w:r>
           </w:p>
         </w:tc>
@@ -2271,7 +2271,7 @@
                 <w:sz w:val="19"/>
                 <w:szCs w:val="19"/>
               </w:rPr>
-              <w:t xml:space="preserve">Politica di esecuzione: finestra oraria, ritentativi, bisezione, abbandono, ritmo</w:t>
+              <w:t xml:space="preserve">Assegna i candidati alle slice rispettando i limiti</w:t>
             </w:r>
           </w:p>
         </w:tc>
@@ -2297,7 +2297,7 @@
                 <w:sz w:val="19"/>
                 <w:szCs w:val="19"/>
               </w:rPr>
-              <w:t xml:space="preserve">Non conosce la persistenza né il SQL</w:t>
+              <w:t xml:space="preserve">Non accede al database: deterministico e privo di I/O</w:t>
             </w:r>
           </w:p>
         </w:tc>
@@ -2324,7 +2324,7 @@
                 <w:sz w:val="19"/>
                 <w:szCs w:val="19"/>
               </w:rPr>
-              <w:t xml:space="preserve">SliceExecutor</w:t>
+              <w:t xml:space="preserve">BatchExecutionCoordinator</w:t>
             </w:r>
           </w:p>
         </w:tc>
@@ -2349,7 +2349,7 @@
                 <w:sz w:val="19"/>
                 <w:szCs w:val="19"/>
               </w:rPr>
-              <w:t xml:space="preserve">Il confine transazionale: una slice, una transazione</w:t>
+              <w:t xml:space="preserve">Politica di esecuzione: finestra oraria, ritentativi, bisezione, abbandono, ritmo</w:t>
             </w:r>
           </w:p>
         </w:tc>
@@ -2374,7 +2374,7 @@
                 <w:sz w:val="19"/>
                 <w:szCs w:val="19"/>
               </w:rPr>
-              <w:t xml:space="preserve">Non decide cosa fare in caso di errore: classifica e riporta</w:t>
+              <w:t xml:space="preserve">Non conosce la persistenza né il SQL</w:t>
             </w:r>
           </w:p>
         </w:tc>
@@ -2402,6 +2402,85 @@
                 <w:sz w:val="19"/>
                 <w:szCs w:val="19"/>
               </w:rPr>
+              <w:t xml:space="preserve">SliceExecutor</w:t>
+            </w:r>
+          </w:p>
+        </w:tc>
+        <w:tc>
+          <w:tcPr>
+            <w:tcW w:type="dxa" w:w="4400"/>
+            <w:shd w:fill="F5F7FA" w:val="clear"/>
+            <w:tcMar>
+              <w:top w:type="dxa" w:w="70"/>
+              <w:left w:type="dxa" w:w="110"/>
+              <w:bottom w:type="dxa" w:w="70"/>
+              <w:right w:type="dxa" w:w="110"/>
+            </w:tcMar>
+          </w:tcPr>
+          <w:p>
+            <w:pPr>
+              <w:spacing w:after="0" w:line="250"/>
+            </w:pPr>
+            <w:r>
+              <w:rPr>
+                <w:b w:val="false"/>
+                <w:bCs w:val="false"/>
+                <w:sz w:val="19"/>
+                <w:szCs w:val="19"/>
+              </w:rPr>
+              <w:t xml:space="preserve">Il confine transazionale: una slice, una transazione</w:t>
+            </w:r>
+          </w:p>
+        </w:tc>
+        <w:tc>
+          <w:tcPr>
+            <w:tcW w:type="dxa" w:w="2500"/>
+            <w:shd w:fill="F5F7FA" w:val="clear"/>
+            <w:tcMar>
+              <w:top w:type="dxa" w:w="70"/>
+              <w:left w:type="dxa" w:w="110"/>
+              <w:bottom w:type="dxa" w:w="70"/>
+              <w:right w:type="dxa" w:w="110"/>
+            </w:tcMar>
+          </w:tcPr>
+          <w:p>
+            <w:pPr>
+              <w:spacing w:after="0" w:line="250"/>
+            </w:pPr>
+            <w:r>
+              <w:rPr>
+                <w:b w:val="false"/>
+                <w:bCs w:val="false"/>
+                <w:sz w:val="19"/>
+                <w:szCs w:val="19"/>
+              </w:rPr>
+              <w:t xml:space="preserve">Non decide cosa fare in caso di errore: classifica e riporta</w:t>
+            </w:r>
+          </w:p>
+        </w:tc>
+      </w:tr>
+      <w:tr>
+        <w:tc>
+          <w:tcPr>
+            <w:tcW w:type="dxa" w:w="2500"/>
+            <w:tcMar>
+              <w:top w:type="dxa" w:w="70"/>
+              <w:left w:type="dxa" w:w="110"/>
+              <w:bottom w:type="dxa" w:w="70"/>
+              <w:right w:type="dxa" w:w="110"/>
+            </w:tcMar>
+          </w:tcPr>
+          <w:p>
+            <w:pPr>
+              <w:spacing w:after="0" w:line="250"/>
+            </w:pPr>
+            <w:r>
+              <w:rPr>
+                <w:b w:val="false"/>
+                <w:bCs w:val="false"/>
+                <w:sz w:val="19"/>
+                <w:szCs w:val="19"/>
+              </w:rPr>
               <w:t xml:space="preserve">PurgeHousekeeping</w:t>
             </w:r>
           </w:p>
@@ -2409,7 +2488,6 @@
         <w:tc>
           <w:tcPr>
             <w:tcW w:type="dxa" w:w="4400"/>
-            <w:shd w:fill="F5F7FA" w:val="clear"/>
             <w:tcMar>
               <w:top w:type="dxa" w:w="70"/>
               <w:left w:type="dxa" w:w="110"/>
@@ -2435,7 +2513,6 @@
         <w:tc>
           <w:tcPr>
             <w:tcW w:type="dxa" w:w="2500"/>
-            <w:shd w:fill="F5F7FA" w:val="clear"/>
             <w:tcMar>
               <w:top w:type="dxa" w:w="70"/>
               <w:left w:type="dxa" w:w="110"/>
@@ -7711,6 +7788,91 @@
           <w:szCs w:val="21"/>
         </w:rPr>
         <w:t xml:space="preserve">Le foreign key non vengono mai disabilitate. Se una cancellazione lasciasse un riferimento pendente, il database la rifiuta: è la rete finale, indipendente da ogni logica applicativa.</w:t>
+      </w:r>
+    </w:p>
+    <w:p>
+      <w:pPr>
+        <w:pStyle w:val="Heading3"/>
+        <w:spacing w:after="100" w:before="200"/>
+      </w:pPr>
+      <w:r>
+        <w:rPr>
+          <w:b/>
+          <w:bCs/>
+          <w:color w:val="2E4570"/>
+          <w:sz w:val="22"/>
+          <w:szCs w:val="22"/>
+        </w:rPr>
+        <w:t xml:space="preserve">Dove stanno i controlli di configurazione</w:t>
+      </w:r>
+    </w:p>
+    <w:p>
+      <w:pPr>
+        <w:spacing w:after="140" w:line="276"/>
+      </w:pPr>
+      <w:r>
+        <w:rPr>
+          <w:sz w:val="21"/>
+          <w:szCs w:val="21"/>
+        </w:rPr>
+        <w:t xml:space="preserve">Il primo livello è raccolto in </w:t>
+      </w:r>
+      <w:r>
+        <w:rPr>
+          <w:rFonts w:ascii="Consolas" w:cs="Consolas" w:eastAsia="Consolas" w:hAnsi="Consolas"/>
+          <w:color w:val="20304A"/>
+          <w:sz w:val="21"/>
+          <w:szCs w:val="21"/>
+        </w:rPr>
+        <w:t xml:space="preserve">PurgeStartupGuard</w:t>
+      </w:r>
+      <w:r>
+        <w:rPr>
+          <w:sz w:val="21"/>
+          <w:szCs w:val="21"/>
+        </w:rPr>
+        <w:t xml:space="preserve">, che risponde a una domanda sola: questa configurazione consente una cancellazione reale? Riceve la modalità, le opzioni e gli argomenti della riga di comando, e restituisce il motivo del rifiuto oppure nulla.</w:t>
+      </w:r>
+    </w:p>
+    <w:p>
+      <w:pPr>
+        <w:spacing w:after="140" w:line="276"/>
+      </w:pPr>
+      <w:r>
+        <w:rPr>
+          <w:sz w:val="21"/>
+          <w:szCs w:val="21"/>
+        </w:rPr>
+        <w:t xml:space="preserve">Sta prima del gate di approvazione perché i due rifiuti sono diversi e non vanno confusi: «manca un parametro» e «nessuno ha approvato questa regola» mandano chi legge in due direzioni opposte, e un messaggio sbagliato alle due di notte costa un'ora.</w:t>
+      </w:r>
+    </w:p>
+    <w:p>
+      <w:pPr>
+        <w:spacing w:after="140" w:line="276"/>
+      </w:pPr>
+      <w:r>
+        <w:rPr>
+          <w:sz w:val="21"/>
+          <w:szCs w:val="21"/>
+        </w:rPr>
+        <w:t xml:space="preserve">È una funzione separata, non un blocco dentro il punto di ingresso, per una ragione appresa a spese proprie. La prima versione del controllo sul fuso viveva nel percorso di avvio e leggeva soltanto lo stato della finestra in configurazione, mentre la rinuncia esplicita alla finestra veniva interpretata più avanti: il risultato era che il comando suggerito come rimedio veniva rifiutato dalla guardia che lo suggeriva. Il difetto era invisibile ai controlli che verificano dove un componente è collegato, e lo è rimasto finché la decisione non è diventata una funzione con i suoi ingressi espliciti, verificabile per comportamento (D-20).</w:t>
+      </w:r>
+    </w:p>
+    <w:p>
+      <w:pPr>
+        <w:pBdr>
+          <w:left w:val="single" w:color="8FA3C0" w:sz="18" w:space="12"/>
+        </w:pBdr>
+        <w:spacing w:after="180" w:before="60" w:line="276"/>
+        <w:ind w:left="360"/>
+      </w:pPr>
+      <w:r>
+        <w:rPr>
+          <w:color w:val="44506B"/>
+          <w:sz w:val="20"/>
+          <w:szCs w:val="20"/>
+        </w:rPr>
+        <w:t xml:space="preserve">È la distinzione fra i due tipi di test che il progetto usa: quelli di collegamento dicono che un componente è al suo posto, quelli comportamentali dicono che fa la cosa giusta. Servono entrambi, e il secondo non si può scrivere finché la logica resta annidata in un percorso che si esegue soltanto avviando l'applicazione.</w:t>
       </w:r>
     </w:p>
     <w:p>

</xml_diff>

<commit_message>
update figures in doc
</commit_message>
<xml_diff>
--- a/docs/architettura/Architecture-Functional-Design-Sfoltimento-2026-09-09.docx
+++ b/docs/architettura/Architecture-Functional-Design-Sfoltimento-2026-09-09.docx
@@ -1660,7 +1660,7 @@
       <w:r>
         <w:drawing>
           <wp:inline distT="0" distB="0" distL="0" distR="0">
-            <wp:extent cx="5852160" cy="3442850"/>
+            <wp:extent cx="5852160" cy="3291840"/>
             <wp:effectExtent t="0" r="0" b="0" l="0"/>
             <wp:docPr id="1" name="" descr="" title=""/>
             <wp:cNvGraphicFramePr>
@@ -1685,7 +1685,7 @@
                   <pic:spPr bwMode="auto">
                     <a:xfrm>
                       <a:off x="0" y="0"/>
-                      <a:ext cx="5852160" cy="3442850"/>
+                      <a:ext cx="5852160" cy="3291840"/>
                     </a:xfrm>
                     <a:prstGeom prst="rect">
                       <a:avLst/>
@@ -3519,7 +3519,7 @@
       <w:r>
         <w:drawing>
           <wp:inline distT="0" distB="0" distL="0" distR="0">
-            <wp:extent cx="5852160" cy="2967375"/>
+            <wp:extent cx="5852160" cy="3291840"/>
             <wp:effectExtent t="0" r="0" b="0" l="0"/>
             <wp:docPr id="1" name="" descr="" title=""/>
             <wp:cNvGraphicFramePr>
@@ -3544,7 +3544,7 @@
                   <pic:spPr bwMode="auto">
                     <a:xfrm>
                       <a:off x="0" y="0"/>
-                      <a:ext cx="5852160" cy="2967375"/>
+                      <a:ext cx="5852160" cy="3291840"/>
                     </a:xfrm>
                     <a:prstGeom prst="rect">
                       <a:avLst/>

</xml_diff>